<commit_message>
Introduce runner status, archive & UI updates
Replace the previous boolean DNF/unranked flags with a unified string-based status and add archive support. Frontend: Modal, RunnersTable, Sidepanel and Pinia store now handle runner.status (status select in modal, status column/icon in table, updated stats, sending status on update). Styles updated for status icons and modal states. Backend: DCA updated for tl_chronometry to use a status field (enum via Status::class), new tl_chronometry_archive DCA and ChronometryArchiveModel added, config registers the archive module and model, and language files/translations added. Also includes build artifact updates (public JS/CSS/maps) and small code/formatting cleanups.
</commit_message>
<xml_diff>
--- a/docx/eternal_list_of_the_best.docx
+++ b/docx/eternal_list_of_the_best.docx
@@ -5,22 +5,24 @@
     <w:p>
       <w:pPr>
         <w:rPr>
-          <w:rFonts w:ascii="Century Gothic" w:hAnsi="Century Gothic"/>
+          <w:rFonts w:ascii="Courier New" w:hAnsi="Courier New" w:cs="Courier New"/>
           <w:sz w:val="52"/>
           <w:szCs w:val="52"/>
         </w:rPr>
       </w:pPr>
+      <w:proofErr w:type="spellStart"/>
       <w:r>
         <w:rPr>
-          <w:rFonts w:ascii="Century Gothic" w:hAnsi="Century Gothic"/>
+          <w:rFonts w:ascii="Courier New" w:hAnsi="Courier New" w:cs="Courier New"/>
           <w:sz w:val="52"/>
           <w:szCs w:val="52"/>
         </w:rPr>
         <w:t>Ewigenbestenliste</w:t>
       </w:r>
+      <w:proofErr w:type="spellEnd"/>
       <w:r>
         <w:rPr>
-          <w:rFonts w:ascii="Century Gothic" w:hAnsi="Century Gothic"/>
+          <w:rFonts w:ascii="Courier New" w:hAnsi="Courier New" w:cs="Courier New"/>
           <w:sz w:val="52"/>
           <w:szCs w:val="52"/>
         </w:rPr>
@@ -30,54 +32,54 @@
     <w:p>
       <w:pPr>
         <w:rPr>
-          <w:rFonts w:ascii="Century Gothic" w:hAnsi="Century Gothic"/>
+          <w:rFonts w:ascii="Courier New" w:hAnsi="Courier New" w:cs="Courier New"/>
         </w:rPr>
       </w:pPr>
       <w:r>
         <w:rPr>
-          <w:rFonts w:ascii="Century Gothic" w:hAnsi="Century Gothic"/>
+          <w:rFonts w:ascii="Courier New" w:hAnsi="Courier New" w:cs="Courier New"/>
         </w:rPr>
         <w:t>Stand</w:t>
       </w:r>
       <w:r>
         <w:rPr>
-          <w:rFonts w:ascii="Century Gothic" w:hAnsi="Century Gothic"/>
+          <w:rFonts w:ascii="Courier New" w:hAnsi="Courier New" w:cs="Courier New"/>
         </w:rPr>
         <w:t xml:space="preserve">, </w:t>
       </w:r>
       <w:r>
         <w:rPr>
-          <w:rFonts w:ascii="Century Gothic" w:hAnsi="Century Gothic"/>
+          <w:rFonts w:ascii="Courier New" w:hAnsi="Courier New" w:cs="Courier New"/>
         </w:rPr>
         <w:t>02</w:t>
       </w:r>
       <w:r>
         <w:rPr>
-          <w:rFonts w:ascii="Century Gothic" w:hAnsi="Century Gothic"/>
+          <w:rFonts w:ascii="Courier New" w:hAnsi="Courier New" w:cs="Courier New"/>
         </w:rPr>
         <w:t xml:space="preserve">. </w:t>
       </w:r>
       <w:r>
         <w:rPr>
-          <w:rFonts w:ascii="Century Gothic" w:hAnsi="Century Gothic"/>
+          <w:rFonts w:ascii="Courier New" w:hAnsi="Courier New" w:cs="Courier New"/>
         </w:rPr>
         <w:t>Juni</w:t>
       </w:r>
       <w:r>
         <w:rPr>
-          <w:rFonts w:ascii="Century Gothic" w:hAnsi="Century Gothic"/>
+          <w:rFonts w:ascii="Courier New" w:hAnsi="Courier New" w:cs="Courier New"/>
         </w:rPr>
         <w:t xml:space="preserve"> 20</w:t>
       </w:r>
       <w:r>
         <w:rPr>
-          <w:rFonts w:ascii="Century Gothic" w:hAnsi="Century Gothic"/>
+          <w:rFonts w:ascii="Courier New" w:hAnsi="Courier New" w:cs="Courier New"/>
         </w:rPr>
         <w:t>2</w:t>
       </w:r>
       <w:r>
         <w:rPr>
-          <w:rFonts w:ascii="Century Gothic" w:hAnsi="Century Gothic"/>
+          <w:rFonts w:ascii="Courier New" w:hAnsi="Courier New" w:cs="Courier New"/>
         </w:rPr>
         <w:t>6</w:t>
       </w:r>
@@ -85,27 +87,29 @@
     <w:p>
       <w:pPr>
         <w:rPr>
-          <w:rFonts w:ascii="Century Gothic" w:hAnsi="Century Gothic"/>
+          <w:rFonts w:ascii="Courier New" w:hAnsi="Courier New" w:cs="Courier New"/>
           <w:b/>
         </w:rPr>
       </w:pPr>
       <w:r>
         <w:rPr>
-          <w:rFonts w:ascii="Century Gothic" w:hAnsi="Century Gothic"/>
+          <w:rFonts w:ascii="Courier New" w:hAnsi="Courier New" w:cs="Courier New"/>
           <w:b/>
         </w:rPr>
         <w:t>Kategorie ${</w:t>
       </w:r>
+      <w:proofErr w:type="spellStart"/>
       <w:r>
         <w:rPr>
-          <w:rFonts w:ascii="Century Gothic" w:hAnsi="Century Gothic"/>
+          <w:rFonts w:ascii="Courier New" w:hAnsi="Courier New" w:cs="Courier New"/>
           <w:b/>
         </w:rPr>
         <w:t>category</w:t>
       </w:r>
+      <w:proofErr w:type="spellEnd"/>
       <w:r>
         <w:rPr>
-          <w:rFonts w:ascii="Century Gothic" w:hAnsi="Century Gothic"/>
+          <w:rFonts w:ascii="Courier New" w:hAnsi="Courier New" w:cs="Courier New"/>
           <w:b/>
         </w:rPr>
         <w:t>}</w:t>
@@ -114,7 +118,7 @@
     <w:tbl>
       <w:tblPr>
         <w:tblStyle w:val="Tabellenraster"/>
-        <w:tblW w:w="0" w:type="auto"/>
+        <w:tblW w:w="10773" w:type="dxa"/>
         <w:tblBorders>
           <w:top w:val="none" w:sz="0" w:space="0" w:color="auto"/>
           <w:left w:val="none" w:sz="0" w:space="0" w:color="auto"/>
@@ -126,23 +130,26 @@
         <w:tblLook w:val="04A0" w:firstRow="1" w:lastRow="0" w:firstColumn="1" w:lastColumn="0" w:noHBand="0" w:noVBand="1"/>
       </w:tblPr>
       <w:tblGrid>
-        <w:gridCol w:w="888"/>
-        <w:gridCol w:w="1225"/>
-        <w:gridCol w:w="1990"/>
-        <w:gridCol w:w="2010"/>
-        <w:gridCol w:w="1447"/>
-        <w:gridCol w:w="1512"/>
+        <w:gridCol w:w="1985"/>
+        <w:gridCol w:w="1297"/>
+        <w:gridCol w:w="2328"/>
+        <w:gridCol w:w="2328"/>
+        <w:gridCol w:w="1134"/>
+        <w:gridCol w:w="1701"/>
       </w:tblGrid>
       <w:tr>
         <w:tc>
           <w:tcPr>
-            <w:tcW w:w="888" w:type="dxa"/>
+            <w:tcW w:w="1985" w:type="dxa"/>
+            <w:tcBorders>
+              <w:bottom w:val="single" w:sz="4" w:space="0" w:color="auto"/>
+            </w:tcBorders>
           </w:tcPr>
           <w:p>
             <w:pPr>
               <w:jc w:val="both"/>
               <w:rPr>
-                <w:rFonts w:ascii="Century Gothic" w:hAnsi="Century Gothic"/>
+                <w:rFonts w:ascii="Courier New" w:hAnsi="Courier New" w:cs="Courier New"/>
                 <w:b/>
                 <w:sz w:val="20"/>
                 <w:szCs w:val="20"/>
@@ -150,7 +157,7 @@
             </w:pPr>
             <w:r>
               <w:rPr>
-                <w:rFonts w:ascii="Century Gothic" w:hAnsi="Century Gothic"/>
+                <w:rFonts w:ascii="Courier New" w:hAnsi="Courier New" w:cs="Courier New"/>
                 <w:b/>
                 <w:sz w:val="20"/>
                 <w:szCs w:val="20"/>
@@ -161,12 +168,15 @@
         </w:tc>
         <w:tc>
           <w:tcPr>
-            <w:tcW w:w="1225" w:type="dxa"/>
+            <w:tcW w:w="1297" w:type="dxa"/>
+            <w:tcBorders>
+              <w:bottom w:val="single" w:sz="4" w:space="0" w:color="auto"/>
+            </w:tcBorders>
           </w:tcPr>
           <w:p>
             <w:pPr>
               <w:rPr>
-                <w:rFonts w:ascii="Century Gothic" w:hAnsi="Century Gothic"/>
+                <w:rFonts w:ascii="Courier New" w:hAnsi="Courier New" w:cs="Courier New"/>
                 <w:b/>
                 <w:sz w:val="20"/>
                 <w:szCs w:val="20"/>
@@ -174,23 +184,44 @@
             </w:pPr>
             <w:r>
               <w:rPr>
-                <w:rFonts w:ascii="Century Gothic" w:hAnsi="Century Gothic"/>
+                <w:rFonts w:ascii="Courier New" w:hAnsi="Courier New" w:cs="Courier New"/>
                 <w:b/>
                 <w:sz w:val="20"/>
                 <w:szCs w:val="20"/>
               </w:rPr>
-              <w:t>St.Nr.</w:t>
+              <w:t>St</w:t>
+            </w:r>
+            <w:r>
+              <w:rPr>
+                <w:rFonts w:ascii="Courier New" w:hAnsi="Courier New" w:cs="Courier New"/>
+                <w:b/>
+                <w:sz w:val="20"/>
+                <w:szCs w:val="20"/>
+              </w:rPr>
+              <w:t>art-</w:t>
+            </w:r>
+            <w:r>
+              <w:rPr>
+                <w:rFonts w:ascii="Courier New" w:hAnsi="Courier New" w:cs="Courier New"/>
+                <w:b/>
+                <w:sz w:val="20"/>
+                <w:szCs w:val="20"/>
+              </w:rPr>
+              <w:t>Nr.</w:t>
             </w:r>
           </w:p>
         </w:tc>
         <w:tc>
           <w:tcPr>
-            <w:tcW w:w="2065" w:type="dxa"/>
+            <w:tcW w:w="2328" w:type="dxa"/>
+            <w:tcBorders>
+              <w:bottom w:val="single" w:sz="4" w:space="0" w:color="auto"/>
+            </w:tcBorders>
           </w:tcPr>
           <w:p>
             <w:pPr>
               <w:rPr>
-                <w:rFonts w:ascii="Century Gothic" w:hAnsi="Century Gothic"/>
+                <w:rFonts w:ascii="Courier New" w:hAnsi="Courier New" w:cs="Courier New"/>
                 <w:b/>
                 <w:sz w:val="20"/>
                 <w:szCs w:val="20"/>
@@ -198,7 +229,7 @@
             </w:pPr>
             <w:r>
               <w:rPr>
-                <w:rFonts w:ascii="Century Gothic" w:hAnsi="Century Gothic"/>
+                <w:rFonts w:ascii="Courier New" w:hAnsi="Courier New" w:cs="Courier New"/>
                 <w:b/>
                 <w:sz w:val="20"/>
                 <w:szCs w:val="20"/>
@@ -209,12 +240,15 @@
         </w:tc>
         <w:tc>
           <w:tcPr>
-            <w:tcW w:w="2086" w:type="dxa"/>
+            <w:tcW w:w="2328" w:type="dxa"/>
+            <w:tcBorders>
+              <w:bottom w:val="single" w:sz="4" w:space="0" w:color="auto"/>
+            </w:tcBorders>
           </w:tcPr>
           <w:p>
             <w:pPr>
               <w:rPr>
-                <w:rFonts w:ascii="Century Gothic" w:hAnsi="Century Gothic"/>
+                <w:rFonts w:ascii="Courier New" w:hAnsi="Courier New" w:cs="Courier New"/>
                 <w:b/>
                 <w:sz w:val="20"/>
                 <w:szCs w:val="20"/>
@@ -222,7 +256,7 @@
             </w:pPr>
             <w:r>
               <w:rPr>
-                <w:rFonts w:ascii="Century Gothic" w:hAnsi="Century Gothic"/>
+                <w:rFonts w:ascii="Courier New" w:hAnsi="Courier New" w:cs="Courier New"/>
                 <w:b/>
                 <w:sz w:val="20"/>
                 <w:szCs w:val="20"/>
@@ -233,13 +267,16 @@
         </w:tc>
         <w:tc>
           <w:tcPr>
-            <w:tcW w:w="1513" w:type="dxa"/>
+            <w:tcW w:w="1134" w:type="dxa"/>
+            <w:tcBorders>
+              <w:bottom w:val="single" w:sz="4" w:space="0" w:color="auto"/>
+            </w:tcBorders>
           </w:tcPr>
           <w:p>
             <w:pPr>
               <w:jc w:val="right"/>
               <w:rPr>
-                <w:rFonts w:ascii="Century Gothic" w:hAnsi="Century Gothic"/>
+                <w:rFonts w:ascii="Courier New" w:hAnsi="Courier New" w:cs="Courier New"/>
                 <w:b/>
                 <w:sz w:val="20"/>
                 <w:szCs w:val="20"/>
@@ -247,7 +284,7 @@
             </w:pPr>
             <w:r>
               <w:rPr>
-                <w:rFonts w:ascii="Century Gothic" w:hAnsi="Century Gothic"/>
+                <w:rFonts w:ascii="Courier New" w:hAnsi="Courier New" w:cs="Courier New"/>
                 <w:b/>
                 <w:sz w:val="20"/>
                 <w:szCs w:val="20"/>
@@ -258,13 +295,16 @@
         </w:tc>
         <w:tc>
           <w:tcPr>
-            <w:tcW w:w="1295" w:type="dxa"/>
+            <w:tcW w:w="1701" w:type="dxa"/>
+            <w:tcBorders>
+              <w:bottom w:val="single" w:sz="4" w:space="0" w:color="auto"/>
+            </w:tcBorders>
           </w:tcPr>
           <w:p>
             <w:pPr>
               <w:jc w:val="right"/>
               <w:rPr>
-                <w:rFonts w:ascii="Century Gothic" w:hAnsi="Century Gothic"/>
+                <w:rFonts w:ascii="Courier New" w:hAnsi="Courier New" w:cs="Courier New"/>
                 <w:b/>
                 <w:sz w:val="20"/>
                 <w:szCs w:val="20"/>
@@ -272,7 +312,7 @@
             </w:pPr>
             <w:r>
               <w:rPr>
-                <w:rFonts w:ascii="Century Gothic" w:hAnsi="Century Gothic"/>
+                <w:rFonts w:ascii="Courier New" w:hAnsi="Courier New" w:cs="Courier New"/>
                 <w:b/>
                 <w:sz w:val="20"/>
                 <w:szCs w:val="20"/>
@@ -285,164 +325,311 @@
       <w:tr>
         <w:tc>
           <w:tcPr>
-            <w:tcW w:w="888" w:type="dxa"/>
+            <w:tcW w:w="1985" w:type="dxa"/>
+            <w:tcBorders>
+              <w:top w:val="single" w:sz="4" w:space="0" w:color="auto"/>
+            </w:tcBorders>
           </w:tcPr>
           <w:p>
             <w:pPr>
               <w:jc w:val="both"/>
               <w:rPr>
-                <w:rFonts w:ascii="Century Gothic" w:hAnsi="Century Gothic"/>
-                <w:sz w:val="20"/>
-                <w:szCs w:val="20"/>
+                <w:rFonts w:ascii="Courier New" w:hAnsi="Courier New" w:cs="Courier New"/>
+                <w:sz w:val="4"/>
+                <w:szCs w:val="4"/>
               </w:rPr>
             </w:pPr>
-            <w:r>
-              <w:rPr>
-                <w:rFonts w:ascii="Century Gothic" w:hAnsi="Century Gothic"/>
-                <w:sz w:val="20"/>
-                <w:szCs w:val="20"/>
-              </w:rPr>
-              <w:t>${rank}</w:t>
-            </w:r>
           </w:p>
         </w:tc>
         <w:tc>
           <w:tcPr>
-            <w:tcW w:w="1225" w:type="dxa"/>
+            <w:tcW w:w="1297" w:type="dxa"/>
+            <w:tcBorders>
+              <w:top w:val="single" w:sz="4" w:space="0" w:color="auto"/>
+            </w:tcBorders>
           </w:tcPr>
           <w:p>
             <w:pPr>
               <w:rPr>
-                <w:rFonts w:ascii="Century Gothic" w:hAnsi="Century Gothic"/>
-                <w:sz w:val="20"/>
-                <w:szCs w:val="20"/>
+                <w:rFonts w:ascii="Courier New" w:hAnsi="Courier New" w:cs="Courier New"/>
+                <w:sz w:val="4"/>
+                <w:szCs w:val="4"/>
               </w:rPr>
             </w:pPr>
-            <w:r>
-              <w:rPr>
-                <w:rFonts w:ascii="Century Gothic" w:hAnsi="Century Gothic"/>
-                <w:sz w:val="20"/>
-                <w:szCs w:val="20"/>
-              </w:rPr>
-              <w:t>${number}</w:t>
-            </w:r>
           </w:p>
         </w:tc>
         <w:tc>
           <w:tcPr>
-            <w:tcW w:w="2065" w:type="dxa"/>
+            <w:tcW w:w="2328" w:type="dxa"/>
+            <w:tcBorders>
+              <w:top w:val="single" w:sz="4" w:space="0" w:color="auto"/>
+            </w:tcBorders>
           </w:tcPr>
           <w:p>
             <w:pPr>
               <w:rPr>
-                <w:rFonts w:ascii="Century Gothic" w:hAnsi="Century Gothic"/>
-                <w:sz w:val="20"/>
-                <w:szCs w:val="20"/>
+                <w:rFonts w:ascii="Courier New" w:hAnsi="Courier New" w:cs="Courier New"/>
+                <w:sz w:val="4"/>
+                <w:szCs w:val="4"/>
               </w:rPr>
             </w:pPr>
-            <w:r>
-              <w:rPr>
-                <w:rFonts w:ascii="Century Gothic" w:hAnsi="Century Gothic"/>
-                <w:sz w:val="20"/>
-                <w:szCs w:val="20"/>
-              </w:rPr>
-              <w:t>${firstname}</w:t>
-            </w:r>
           </w:p>
         </w:tc>
         <w:tc>
           <w:tcPr>
-            <w:tcW w:w="2086" w:type="dxa"/>
+            <w:tcW w:w="2328" w:type="dxa"/>
+            <w:tcBorders>
+              <w:top w:val="single" w:sz="4" w:space="0" w:color="auto"/>
+            </w:tcBorders>
           </w:tcPr>
           <w:p>
             <w:pPr>
               <w:rPr>
-                <w:rFonts w:ascii="Century Gothic" w:hAnsi="Century Gothic"/>
-                <w:sz w:val="20"/>
-                <w:szCs w:val="20"/>
+                <w:rFonts w:ascii="Courier New" w:hAnsi="Courier New" w:cs="Courier New"/>
+                <w:sz w:val="4"/>
+                <w:szCs w:val="4"/>
               </w:rPr>
             </w:pPr>
-            <w:r>
-              <w:rPr>
-                <w:rFonts w:ascii="Century Gothic" w:hAnsi="Century Gothic"/>
-                <w:sz w:val="20"/>
-                <w:szCs w:val="20"/>
-              </w:rPr>
-              <w:t>${</w:t>
-            </w:r>
-            <w:r>
-              <w:rPr>
-                <w:rFonts w:ascii="Century Gothic" w:hAnsi="Century Gothic"/>
-                <w:sz w:val="20"/>
-                <w:szCs w:val="20"/>
-              </w:rPr>
-              <w:t>lastname</w:t>
-            </w:r>
-            <w:r>
-              <w:rPr>
-                <w:rFonts w:ascii="Century Gothic" w:hAnsi="Century Gothic"/>
-                <w:sz w:val="20"/>
-                <w:szCs w:val="20"/>
-              </w:rPr>
-              <w:t>}</w:t>
-            </w:r>
           </w:p>
         </w:tc>
         <w:tc>
           <w:tcPr>
-            <w:tcW w:w="1513" w:type="dxa"/>
+            <w:tcW w:w="1134" w:type="dxa"/>
+            <w:tcBorders>
+              <w:top w:val="single" w:sz="4" w:space="0" w:color="auto"/>
+            </w:tcBorders>
           </w:tcPr>
           <w:p>
             <w:pPr>
               <w:jc w:val="right"/>
               <w:rPr>
-                <w:rFonts w:ascii="Century Gothic" w:hAnsi="Century Gothic"/>
-                <w:sz w:val="20"/>
-                <w:szCs w:val="20"/>
+                <w:rFonts w:ascii="Courier New" w:hAnsi="Courier New" w:cs="Courier New"/>
+                <w:sz w:val="4"/>
+                <w:szCs w:val="4"/>
               </w:rPr>
             </w:pPr>
-            <w:r>
-              <w:rPr>
-                <w:rFonts w:ascii="Century Gothic" w:hAnsi="Century Gothic"/>
-                <w:sz w:val="20"/>
-                <w:szCs w:val="20"/>
-              </w:rPr>
-              <w:t>${time}</w:t>
-            </w:r>
           </w:p>
         </w:tc>
         <w:tc>
           <w:tcPr>
-            <w:tcW w:w="1295" w:type="dxa"/>
+            <w:tcW w:w="1701" w:type="dxa"/>
+            <w:tcBorders>
+              <w:top w:val="single" w:sz="4" w:space="0" w:color="auto"/>
+            </w:tcBorders>
           </w:tcPr>
           <w:p>
             <w:pPr>
               <w:jc w:val="right"/>
               <w:rPr>
-                <w:rFonts w:ascii="Century Gothic" w:hAnsi="Century Gothic"/>
-                <w:sz w:val="20"/>
-                <w:szCs w:val="20"/>
+                <w:rFonts w:ascii="Courier New" w:hAnsi="Courier New" w:cs="Courier New"/>
+                <w:sz w:val="4"/>
+                <w:szCs w:val="4"/>
               </w:rPr>
             </w:pPr>
-            <w:r>
-              <w:rPr>
-                <w:rFonts w:ascii="Century Gothic" w:hAnsi="Century Gothic"/>
+          </w:p>
+        </w:tc>
+      </w:tr>
+      <w:tr>
+        <w:tc>
+          <w:tcPr>
+            <w:tcW w:w="1985" w:type="dxa"/>
+          </w:tcPr>
+          <w:p>
+            <w:pPr>
+              <w:jc w:val="both"/>
+              <w:rPr>
+                <w:rFonts w:ascii="Courier New" w:hAnsi="Courier New" w:cs="Courier New"/>
+                <w:sz w:val="20"/>
+                <w:szCs w:val="20"/>
+              </w:rPr>
+            </w:pPr>
+            <w:r>
+              <w:rPr>
+                <w:rFonts w:ascii="Courier New" w:hAnsi="Courier New" w:cs="Courier New"/>
+                <w:sz w:val="20"/>
+                <w:szCs w:val="20"/>
+              </w:rPr>
+              <w:t>${rank}</w:t>
+            </w:r>
+          </w:p>
+        </w:tc>
+        <w:tc>
+          <w:tcPr>
+            <w:tcW w:w="1297" w:type="dxa"/>
+          </w:tcPr>
+          <w:p>
+            <w:pPr>
+              <w:rPr>
+                <w:rFonts w:ascii="Courier New" w:hAnsi="Courier New" w:cs="Courier New"/>
+                <w:sz w:val="20"/>
+                <w:szCs w:val="20"/>
+              </w:rPr>
+            </w:pPr>
+            <w:r>
+              <w:rPr>
+                <w:rFonts w:ascii="Courier New" w:hAnsi="Courier New" w:cs="Courier New"/>
                 <w:sz w:val="20"/>
                 <w:szCs w:val="20"/>
               </w:rPr>
               <w:t>${</w:t>
             </w:r>
-            <w:r>
-              <w:rPr>
-                <w:rFonts w:ascii="Century Gothic" w:hAnsi="Century Gothic"/>
+            <w:proofErr w:type="spellStart"/>
+            <w:r>
+              <w:rPr>
+                <w:rFonts w:ascii="Courier New" w:hAnsi="Courier New" w:cs="Courier New"/>
+                <w:sz w:val="20"/>
+                <w:szCs w:val="20"/>
+              </w:rPr>
+              <w:t>number</w:t>
+            </w:r>
+            <w:proofErr w:type="spellEnd"/>
+            <w:r>
+              <w:rPr>
+                <w:rFonts w:ascii="Courier New" w:hAnsi="Courier New" w:cs="Courier New"/>
+                <w:sz w:val="20"/>
+                <w:szCs w:val="20"/>
+              </w:rPr>
+              <w:t>}</w:t>
+            </w:r>
+          </w:p>
+        </w:tc>
+        <w:tc>
+          <w:tcPr>
+            <w:tcW w:w="2328" w:type="dxa"/>
+          </w:tcPr>
+          <w:p>
+            <w:pPr>
+              <w:rPr>
+                <w:rFonts w:ascii="Courier New" w:hAnsi="Courier New" w:cs="Courier New"/>
+                <w:sz w:val="20"/>
+                <w:szCs w:val="20"/>
+              </w:rPr>
+            </w:pPr>
+            <w:r>
+              <w:rPr>
+                <w:rFonts w:ascii="Courier New" w:hAnsi="Courier New" w:cs="Courier New"/>
+                <w:sz w:val="20"/>
+                <w:szCs w:val="20"/>
+              </w:rPr>
+              <w:t>${</w:t>
+            </w:r>
+            <w:proofErr w:type="spellStart"/>
+            <w:r>
+              <w:rPr>
+                <w:rFonts w:ascii="Courier New" w:hAnsi="Courier New" w:cs="Courier New"/>
+                <w:sz w:val="20"/>
+                <w:szCs w:val="20"/>
+              </w:rPr>
+              <w:t>firstname</w:t>
+            </w:r>
+            <w:proofErr w:type="spellEnd"/>
+            <w:r>
+              <w:rPr>
+                <w:rFonts w:ascii="Courier New" w:hAnsi="Courier New" w:cs="Courier New"/>
+                <w:sz w:val="20"/>
+                <w:szCs w:val="20"/>
+              </w:rPr>
+              <w:t>}</w:t>
+            </w:r>
+          </w:p>
+        </w:tc>
+        <w:tc>
+          <w:tcPr>
+            <w:tcW w:w="2328" w:type="dxa"/>
+          </w:tcPr>
+          <w:p>
+            <w:pPr>
+              <w:rPr>
+                <w:rFonts w:ascii="Courier New" w:hAnsi="Courier New" w:cs="Courier New"/>
+                <w:sz w:val="20"/>
+                <w:szCs w:val="20"/>
+              </w:rPr>
+            </w:pPr>
+            <w:r>
+              <w:rPr>
+                <w:rFonts w:ascii="Courier New" w:hAnsi="Courier New" w:cs="Courier New"/>
+                <w:sz w:val="20"/>
+                <w:szCs w:val="20"/>
+              </w:rPr>
+              <w:t>${</w:t>
+            </w:r>
+            <w:proofErr w:type="spellStart"/>
+            <w:r>
+              <w:rPr>
+                <w:rFonts w:ascii="Courier New" w:hAnsi="Courier New" w:cs="Courier New"/>
+                <w:sz w:val="20"/>
+                <w:szCs w:val="20"/>
+              </w:rPr>
+              <w:t>lastname</w:t>
+            </w:r>
+            <w:proofErr w:type="spellEnd"/>
+            <w:r>
+              <w:rPr>
+                <w:rFonts w:ascii="Courier New" w:hAnsi="Courier New" w:cs="Courier New"/>
+                <w:sz w:val="20"/>
+                <w:szCs w:val="20"/>
+              </w:rPr>
+              <w:t>}</w:t>
+            </w:r>
+          </w:p>
+        </w:tc>
+        <w:tc>
+          <w:tcPr>
+            <w:tcW w:w="1134" w:type="dxa"/>
+          </w:tcPr>
+          <w:p>
+            <w:pPr>
+              <w:jc w:val="right"/>
+              <w:rPr>
+                <w:rFonts w:ascii="Courier New" w:hAnsi="Courier New" w:cs="Courier New"/>
+                <w:sz w:val="20"/>
+                <w:szCs w:val="20"/>
+              </w:rPr>
+            </w:pPr>
+            <w:r>
+              <w:rPr>
+                <w:rFonts w:ascii="Courier New" w:hAnsi="Courier New" w:cs="Courier New"/>
+                <w:sz w:val="20"/>
+                <w:szCs w:val="20"/>
+              </w:rPr>
+              <w:t>${time}</w:t>
+            </w:r>
+          </w:p>
+        </w:tc>
+        <w:tc>
+          <w:tcPr>
+            <w:tcW w:w="1701" w:type="dxa"/>
+          </w:tcPr>
+          <w:p>
+            <w:pPr>
+              <w:jc w:val="right"/>
+              <w:rPr>
+                <w:rFonts w:ascii="Courier New" w:hAnsi="Courier New" w:cs="Courier New"/>
+                <w:sz w:val="20"/>
+                <w:szCs w:val="20"/>
+              </w:rPr>
+            </w:pPr>
+            <w:r>
+              <w:rPr>
+                <w:rFonts w:ascii="Courier New" w:hAnsi="Courier New" w:cs="Courier New"/>
+                <w:sz w:val="20"/>
+                <w:szCs w:val="20"/>
+              </w:rPr>
+              <w:t>${</w:t>
+            </w:r>
+            <w:proofErr w:type="spellStart"/>
+            <w:r>
+              <w:rPr>
+                <w:rFonts w:ascii="Courier New" w:hAnsi="Courier New" w:cs="Courier New"/>
                 <w:sz w:val="20"/>
                 <w:szCs w:val="20"/>
               </w:rPr>
               <w:t>eventDate</w:t>
             </w:r>
-            <w:r>
-              <w:rPr>
-                <w:rFonts w:ascii="Century Gothic" w:hAnsi="Century Gothic"/>
+            <w:proofErr w:type="spellEnd"/>
+            <w:r>
+              <w:rPr>
+                <w:rFonts w:ascii="Courier New" w:hAnsi="Courier New" w:cs="Courier New"/>
                 <w:sz w:val="20"/>
                 <w:szCs w:val="20"/>
               </w:rPr>
@@ -465,7 +652,7 @@
           <w:noProof/>
         </w:rPr>
         <w:drawing>
-          <wp:anchor distT="0" distB="0" distL="114300" distR="114300" simplePos="0" relativeHeight="251658240" behindDoc="0" locked="0" layoutInCell="1" allowOverlap="1" wp14:anchorId="5415FC56" wp14:editId="1DF9DE81">
+          <wp:anchor distT="0" distB="0" distL="114300" distR="114300" simplePos="0" relativeHeight="251658240" behindDoc="0" locked="0" layoutInCell="1" allowOverlap="1" wp14:anchorId="5415FC56" wp14:editId="53D6F803">
             <wp:simplePos x="0" y="0"/>
             <wp:positionH relativeFrom="margin">
               <wp:posOffset>1957705</wp:posOffset>
@@ -531,7 +718,7 @@
     <w:sectPr>
       <w:footerReference w:type="default" r:id="rId7"/>
       <w:pgSz w:w="11906" w:h="16838"/>
-      <w:pgMar w:top="426" w:right="1417" w:bottom="1985" w:left="1417" w:header="708" w:footer="1537" w:gutter="0"/>
+      <w:pgMar w:top="426" w:right="566" w:bottom="1985" w:left="567" w:header="708" w:footer="1537" w:gutter="0"/>
       <w:cols w:space="708"/>
       <w:docGrid w:linePitch="360"/>
     </w:sectPr>
@@ -595,7 +782,7 @@
               <wp:lineTo x="0" y="0"/>
             </wp:wrapPolygon>
           </wp:wrapTight>
-          <wp:docPr id="40" name="Grafik 40" descr="logo-g"/>
+          <wp:docPr id="210408507" name="Grafik 210408507" descr="logo-g"/>
           <wp:cNvGraphicFramePr>
             <a:graphicFrameLocks xmlns:a="http://schemas.openxmlformats.org/drawingml/2006/main" noChangeAspect="1"/>
           </wp:cNvGraphicFramePr>
@@ -660,7 +847,7 @@
           <wp:extent cx="1371600" cy="788035"/>
           <wp:effectExtent l="0" t="0" r="0" b="0"/>
           <wp:wrapNone/>
-          <wp:docPr id="41" name="Grafik 41" descr="Bildergebnis fÃ¼r kunz sport Logo"/>
+          <wp:docPr id="2065728743" name="Grafik 2065728743" descr="Bildergebnis fÃ¼r kunz sport Logo"/>
           <wp:cNvGraphicFramePr>
             <a:graphicFrameLocks xmlns:a="http://schemas.openxmlformats.org/drawingml/2006/main" noChangeAspect="1"/>
           </wp:cNvGraphicFramePr>

</xml_diff>

<commit_message>
Add chronometry frontend and language refactor
Introduce a Chronometry frontend content element and template, add controller and validator classes, and refactor language keys for categories into a CHRONOMETRY namespace. Rename the online-check store action and callers (checkIsOnline -> checkOnlineState) in the Vue store and app bootstrap. Update Contao DCA references to use the new language keys, add tl_content palettes for the content element, and remove duplicated category entries from tl_chronometry* language files. Refresh built assets (JS bundle, source maps, manifest/entrypoints) and update several PHP helpers, Ajax handlers and PhpOffice classes to support the new functionality.
</commit_message>
<xml_diff>
--- a/docx/eternal_list_of_the_best.docx
+++ b/docx/eternal_list_of_the_best.docx
@@ -6,6 +6,8 @@
       <w:pPr>
         <w:rPr>
           <w:rFonts w:ascii="Courier New" w:hAnsi="Courier New" w:cs="Courier New"/>
+          <w:b/>
+          <w:bCs/>
           <w:sz w:val="52"/>
           <w:szCs w:val="52"/>
         </w:rPr>
@@ -14,6 +16,8 @@
       <w:r>
         <w:rPr>
           <w:rFonts w:ascii="Courier New" w:hAnsi="Courier New" w:cs="Courier New"/>
+          <w:b/>
+          <w:bCs/>
           <w:sz w:val="52"/>
           <w:szCs w:val="52"/>
         </w:rPr>
@@ -23,6 +27,8 @@
       <w:r>
         <w:rPr>
           <w:rFonts w:ascii="Courier New" w:hAnsi="Courier New" w:cs="Courier New"/>
+          <w:b/>
+          <w:bCs/>
           <w:sz w:val="52"/>
           <w:szCs w:val="52"/>
         </w:rPr>
@@ -647,78 +653,11 @@
           <w:color w:val="000000"/>
         </w:rPr>
       </w:pPr>
-      <w:r>
-        <w:rPr>
-          <w:noProof/>
-        </w:rPr>
-        <w:drawing>
-          <wp:anchor distT="0" distB="0" distL="114300" distR="114300" simplePos="0" relativeHeight="251658240" behindDoc="0" locked="0" layoutInCell="1" allowOverlap="1" wp14:anchorId="5415FC56" wp14:editId="53D6F803">
-            <wp:simplePos x="0" y="0"/>
-            <wp:positionH relativeFrom="margin">
-              <wp:posOffset>1957705</wp:posOffset>
-            </wp:positionH>
-            <wp:positionV relativeFrom="paragraph">
-              <wp:posOffset>7914005</wp:posOffset>
-            </wp:positionV>
-            <wp:extent cx="952500" cy="829372"/>
-            <wp:effectExtent l="0" t="0" r="0" b="0"/>
-            <wp:wrapNone/>
-            <wp:docPr id="1" name="Grafik 1"/>
-            <wp:cNvGraphicFramePr>
-              <a:graphicFrameLocks xmlns:a="http://schemas.openxmlformats.org/drawingml/2006/main" noChangeAspect="1"/>
-            </wp:cNvGraphicFramePr>
-            <a:graphic xmlns:a="http://schemas.openxmlformats.org/drawingml/2006/main">
-              <a:graphicData uri="http://schemas.openxmlformats.org/drawingml/2006/picture">
-                <pic:pic xmlns:pic="http://schemas.openxmlformats.org/drawingml/2006/picture">
-                  <pic:nvPicPr>
-                    <pic:cNvPr id="0" name="Picture 1"/>
-                    <pic:cNvPicPr>
-                      <a:picLocks noChangeAspect="1" noChangeArrowheads="1"/>
-                    </pic:cNvPicPr>
-                  </pic:nvPicPr>
-                  <pic:blipFill>
-                    <a:blip r:embed="rId6" cstate="print">
-                      <a:extLst>
-                        <a:ext uri="{28A0092B-C50C-407E-A947-70E740481C1C}">
-                          <a14:useLocalDpi xmlns:a14="http://schemas.microsoft.com/office/drawing/2010/main" val="0"/>
-                        </a:ext>
-                      </a:extLst>
-                    </a:blip>
-                    <a:srcRect/>
-                    <a:stretch>
-                      <a:fillRect/>
-                    </a:stretch>
-                  </pic:blipFill>
-                  <pic:spPr bwMode="auto">
-                    <a:xfrm>
-                      <a:off x="0" y="0"/>
-                      <a:ext cx="952500" cy="829372"/>
-                    </a:xfrm>
-                    <a:prstGeom prst="rect">
-                      <a:avLst/>
-                    </a:prstGeom>
-                    <a:noFill/>
-                    <a:ln>
-                      <a:noFill/>
-                    </a:ln>
-                  </pic:spPr>
-                </pic:pic>
-              </a:graphicData>
-            </a:graphic>
-            <wp14:sizeRelH relativeFrom="margin">
-              <wp14:pctWidth>0</wp14:pctWidth>
-            </wp14:sizeRelH>
-            <wp14:sizeRelV relativeFrom="margin">
-              <wp14:pctHeight>0</wp14:pctHeight>
-            </wp14:sizeRelV>
-          </wp:anchor>
-        </w:drawing>
-      </w:r>
     </w:p>
     <w:sectPr>
-      <w:footerReference w:type="default" r:id="rId7"/>
+      <w:footerReference w:type="default" r:id="rId6"/>
       <w:pgSz w:w="11906" w:h="16838"/>
-      <w:pgMar w:top="426" w:right="566" w:bottom="1985" w:left="567" w:header="708" w:footer="1537" w:gutter="0"/>
+      <w:pgMar w:top="426" w:right="566" w:bottom="1985" w:left="567" w:header="708" w:footer="409" w:gutter="0"/>
       <w:cols w:space="708"/>
       <w:docGrid w:linePitch="360"/>
     </w:sectPr>
@@ -763,26 +702,10 @@
         <w:lang w:eastAsia="de-CH"/>
       </w:rPr>
       <w:drawing>
-        <wp:anchor distT="0" distB="0" distL="114300" distR="114300" simplePos="0" relativeHeight="251662336" behindDoc="1" locked="0" layoutInCell="1" allowOverlap="1" wp14:anchorId="52B3EB03" wp14:editId="5B4BB90A">
-          <wp:simplePos x="0" y="0"/>
-          <wp:positionH relativeFrom="margin">
-            <wp:align>left</wp:align>
-          </wp:positionH>
-          <wp:positionV relativeFrom="paragraph">
-            <wp:posOffset>15240</wp:posOffset>
-          </wp:positionV>
-          <wp:extent cx="476250" cy="833120"/>
-          <wp:effectExtent l="0" t="0" r="0" b="5080"/>
-          <wp:wrapTight wrapText="bothSides">
-            <wp:wrapPolygon edited="0">
-              <wp:start x="0" y="0"/>
-              <wp:lineTo x="0" y="21238"/>
-              <wp:lineTo x="20736" y="21238"/>
-              <wp:lineTo x="20736" y="0"/>
-              <wp:lineTo x="0" y="0"/>
-            </wp:wrapPolygon>
-          </wp:wrapTight>
-          <wp:docPr id="210408507" name="Grafik 210408507" descr="logo-g"/>
+        <wp:inline distT="0" distB="0" distL="0" distR="0" wp14:anchorId="1F3E6E1F" wp14:editId="77B68C87">
+          <wp:extent cx="1638095" cy="720000"/>
+          <wp:effectExtent l="0" t="0" r="0" b="4445"/>
+          <wp:docPr id="1704856126" name="Grafik 1"/>
           <wp:cNvGraphicFramePr>
             <a:graphicFrameLocks xmlns:a="http://schemas.openxmlformats.org/drawingml/2006/main" noChangeAspect="1"/>
           </wp:cNvGraphicFramePr>
@@ -790,13 +713,68 @@
             <a:graphicData uri="http://schemas.openxmlformats.org/drawingml/2006/picture">
               <pic:pic xmlns:pic="http://schemas.openxmlformats.org/drawingml/2006/picture">
                 <pic:nvPicPr>
-                  <pic:cNvPr id="0" name="Grafik 1" descr="logo-g"/>
+                  <pic:cNvPr id="1176254328" name="Grafik 1176254328"/>
+                  <pic:cNvPicPr/>
+                </pic:nvPicPr>
+                <pic:blipFill>
+                  <a:blip r:embed="rId1">
+                    <a:extLst>
+                      <a:ext uri="{96DAC541-7B7A-43D3-8B79-37D633B846F1}">
+                        <asvg:svgBlip xmlns:asvg="http://schemas.microsoft.com/office/drawing/2016/SVG/main" r:embed="rId2"/>
+                      </a:ext>
+                    </a:extLst>
+                  </a:blip>
+                  <a:stretch>
+                    <a:fillRect/>
+                  </a:stretch>
+                </pic:blipFill>
+                <pic:spPr>
+                  <a:xfrm>
+                    <a:off x="0" y="0"/>
+                    <a:ext cx="1638095" cy="720000"/>
+                  </a:xfrm>
+                  <a:prstGeom prst="rect">
+                    <a:avLst/>
+                  </a:prstGeom>
+                </pic:spPr>
+              </pic:pic>
+            </a:graphicData>
+          </a:graphic>
+        </wp:inline>
+      </w:drawing>
+    </w:r>
+    <w:r>
+      <w:rPr>
+        <w:noProof/>
+        <w:lang w:eastAsia="de-CH"/>
+      </w:rPr>
+      <w:drawing>
+        <wp:anchor distT="0" distB="0" distL="114300" distR="114300" simplePos="0" relativeHeight="251660288" behindDoc="0" locked="0" layoutInCell="1" allowOverlap="1" wp14:anchorId="0306A481" wp14:editId="6E20B968">
+          <wp:simplePos x="0" y="0"/>
+          <wp:positionH relativeFrom="margin">
+            <wp:align>right</wp:align>
+          </wp:positionH>
+          <wp:positionV relativeFrom="paragraph">
+            <wp:posOffset>5715</wp:posOffset>
+          </wp:positionV>
+          <wp:extent cx="1253183" cy="720000"/>
+          <wp:effectExtent l="0" t="0" r="4445" b="4445"/>
+          <wp:wrapNone/>
+          <wp:docPr id="1116153455" name="Grafik 1116153455" descr="Bildergebnis fÃ¼r kunz sport Logo"/>
+          <wp:cNvGraphicFramePr>
+            <a:graphicFrameLocks xmlns:a="http://schemas.openxmlformats.org/drawingml/2006/main" noChangeAspect="1"/>
+          </wp:cNvGraphicFramePr>
+          <a:graphic xmlns:a="http://schemas.openxmlformats.org/drawingml/2006/main">
+            <a:graphicData uri="http://schemas.openxmlformats.org/drawingml/2006/picture">
+              <pic:pic xmlns:pic="http://schemas.openxmlformats.org/drawingml/2006/picture">
+                <pic:nvPicPr>
+                  <pic:cNvPr id="0" name="Picture 1" descr="Bildergebnis fÃ¼r kunz sport Logo"/>
                   <pic:cNvPicPr>
-                    <a:picLocks noChangeArrowheads="1"/>
+                    <a:picLocks noChangeAspect="1" noChangeArrowheads="1"/>
                   </pic:cNvPicPr>
                 </pic:nvPicPr>
                 <pic:blipFill>
-                  <a:blip r:embed="rId1">
+                  <a:blip r:embed="rId3" cstate="print">
                     <a:extLst>
                       <a:ext uri="{28A0092B-C50C-407E-A947-70E740481C1C}">
                         <a14:useLocalDpi xmlns:a14="http://schemas.microsoft.com/office/drawing/2010/main" val="0"/>
@@ -811,72 +789,7 @@
                 <pic:spPr bwMode="auto">
                   <a:xfrm>
                     <a:off x="0" y="0"/>
-                    <a:ext cx="476250" cy="833120"/>
-                  </a:xfrm>
-                  <a:prstGeom prst="rect">
-                    <a:avLst/>
-                  </a:prstGeom>
-                  <a:noFill/>
-                </pic:spPr>
-              </pic:pic>
-            </a:graphicData>
-          </a:graphic>
-          <wp14:sizeRelH relativeFrom="page">
-            <wp14:pctWidth>0</wp14:pctWidth>
-          </wp14:sizeRelH>
-          <wp14:sizeRelV relativeFrom="page">
-            <wp14:pctHeight>0</wp14:pctHeight>
-          </wp14:sizeRelV>
-        </wp:anchor>
-      </w:drawing>
-    </w:r>
-    <w:r>
-      <w:rPr>
-        <w:noProof/>
-        <w:lang w:eastAsia="de-CH"/>
-      </w:rPr>
-      <w:drawing>
-        <wp:anchor distT="0" distB="0" distL="114300" distR="114300" simplePos="0" relativeHeight="251660288" behindDoc="0" locked="0" layoutInCell="1" allowOverlap="1" wp14:anchorId="0306A481" wp14:editId="30E1A39C">
-          <wp:simplePos x="0" y="0"/>
-          <wp:positionH relativeFrom="margin">
-            <wp:align>right</wp:align>
-          </wp:positionH>
-          <wp:positionV relativeFrom="paragraph">
-            <wp:posOffset>5715</wp:posOffset>
-          </wp:positionV>
-          <wp:extent cx="1371600" cy="788035"/>
-          <wp:effectExtent l="0" t="0" r="0" b="0"/>
-          <wp:wrapNone/>
-          <wp:docPr id="2065728743" name="Grafik 2065728743" descr="Bildergebnis fÃ¼r kunz sport Logo"/>
-          <wp:cNvGraphicFramePr>
-            <a:graphicFrameLocks xmlns:a="http://schemas.openxmlformats.org/drawingml/2006/main" noChangeAspect="1"/>
-          </wp:cNvGraphicFramePr>
-          <a:graphic xmlns:a="http://schemas.openxmlformats.org/drawingml/2006/main">
-            <a:graphicData uri="http://schemas.openxmlformats.org/drawingml/2006/picture">
-              <pic:pic xmlns:pic="http://schemas.openxmlformats.org/drawingml/2006/picture">
-                <pic:nvPicPr>
-                  <pic:cNvPr id="0" name="Picture 1" descr="Bildergebnis fÃ¼r kunz sport Logo"/>
-                  <pic:cNvPicPr>
-                    <a:picLocks noChangeAspect="1" noChangeArrowheads="1"/>
-                  </pic:cNvPicPr>
-                </pic:nvPicPr>
-                <pic:blipFill>
-                  <a:blip r:embed="rId2" cstate="print">
-                    <a:extLst>
-                      <a:ext uri="{28A0092B-C50C-407E-A947-70E740481C1C}">
-                        <a14:useLocalDpi xmlns:a14="http://schemas.microsoft.com/office/drawing/2010/main" val="0"/>
-                      </a:ext>
-                    </a:extLst>
-                  </a:blip>
-                  <a:srcRect/>
-                  <a:stretch>
-                    <a:fillRect/>
-                  </a:stretch>
-                </pic:blipFill>
-                <pic:spPr bwMode="auto">
-                  <a:xfrm>
-                    <a:off x="0" y="0"/>
-                    <a:ext cx="1371600" cy="788035"/>
+                    <a:ext cx="1253183" cy="720000"/>
                   </a:xfrm>
                   <a:prstGeom prst="rect">
                     <a:avLst/>

</xml_diff>